<commit_message>
chore: remove legacy Python backend; port data generator to TS
</commit_message>
<xml_diff>
--- a/submission/official/C-VIRSYS-ExecutionEvidence.docx
+++ b/submission/official/C-VIRSYS-ExecutionEvidence.docx
@@ -4958,7 +4958,7 @@
         <w:ind w:left="317"/>
       </w:pPr>
       <w:r>
-        <w:t>Prerequisite: Node 20+. No Python, API keys or network access are needed; everything runs offline on synthetic data.</w:t>
+        <w:t>Prerequisite: Node 20+ only. No API keys or network access are needed; everything runs offline on synthetic data.</w:t>
       </w:r>
     </w:p>
     <w:p>
@@ -5028,7 +5028,7 @@
           <w:rFonts w:ascii="Consolas" w:hAnsi="Consolas" w:eastAsia="Consolas"/>
           <w:sz w:val="17"/>
         </w:rPr>
-        <w:t>make test        # vitest: unit, differential, API, golden (25 tasks), attacks (17)</w:t>
+        <w:t>make test        # vitest: unit, reference vectors, API, golden (25 tasks), attacks (17)</w:t>
       </w:r>
     </w:p>
     <w:p>

</xml_diff>